<commit_message>
Remove scheduled tasks lock file and update Singapore healthcare case study for clarity
</commit_message>
<xml_diff>
--- a/docs/cases/08-singapore-healthcare.docx
+++ b/docs/cases/08-singapore-healthcare.docx
@@ -31,7 +31,7 @@
         <w:pStyle w:val="Date"/>
       </w:pPr>
       <w:r>
-        <w:t xml:space="preserve">2026-06-01</w:t>
+        <w:t xml:space="preserve">2026-06-02</w:t>
       </w:r>
     </w:p>
     <w:sdt>
@@ -654,7 +654,7 @@
         <w:pStyle w:val="FirstParagraph"/>
       </w:pPr>
       <w:r>
-        <w:t xml:space="preserve">Notice the philosophy buried in that design. Singapore wants you to feel the cost of routine care, so you spend your own MediSave dollars on small things. It pools money only for the</w:t>
+        <w:t xml:space="preserve">The design has a philosophy. Singapore wants you to feel the cost of routine care, so you spend your own MediSave dollars on small things. It pools money only for the</w:t>
       </w:r>
       <w:r>
         <w:t xml:space="preserve"> </w:t>
@@ -1032,7 +1032,7 @@
         <w:pStyle w:val="BodyText"/>
       </w:pPr>
       <w:r>
-        <w:t xml:space="preserve">Two facts sit side by side here, and both are true. First, very few of these workers</w:t>
+        <w:t xml:space="preserve">Very few of these workers</w:t>
       </w:r>
       <w:r>
         <w:t xml:space="preserve"> </w:t>
@@ -1048,7 +1048,7 @@
         <w:t xml:space="preserve"> </w:t>
       </w:r>
       <w:r>
-        <w:t xml:space="preserve">— most are young men, so the dormitory outbreak was enormous in cases but small in deaths. Second, they had been living in conditions that made an outbreak almost certain, in a country famous for control and order. These workers are about a third of Singapore’s population, and they are</w:t>
+        <w:t xml:space="preserve">— most are young men, so the dormitory outbreak was enormous in cases but small in deaths. Yet they had been living in conditions that made an outbreak almost certain, in a country famous for control and order. These workers are about a third of Singapore’s population, and they are</w:t>
       </w:r>
       <w:r>
         <w:t xml:space="preserve"> </w:t>
@@ -1245,7 +1245,7 @@
         <w:pStyle w:val="BodyText"/>
       </w:pPr>
       <w:r>
-        <w:t xml:space="preserve">Both camps look at Singapore and see their own ideals confirmed. When a single example is claimed as proof by people who disagree about everything, that is a clue. It usually means each side is looking at a different part of the elephant — and that the real system is doing something more complicated than either story admits.</w:t>
+        <w:t xml:space="preserve">Both camps look at Singapore and see their own ideals confirmed. A system claimed as proof by people who agree on nothing is usually doing something more complicated than either story admits — and each side is describing only the part that flatters its own view.</w:t>
       </w:r>
     </w:p>
     <w:bookmarkEnd w:id="10"/>
@@ -1570,7 +1570,7 @@
         <w:t xml:space="preserve"> </w:t>
       </w:r>
       <w:r>
-        <w:t xml:space="preserve">— a deliberate hybrid. This matters for the US debate, because each American faction tends to grab the one piece that resembles its preferred model and ignore the rest. The conservative sees the out-of-pocket gear; the progressive sees the Beveridge gear. Singapore only works because it bolts them together.</w:t>
+        <w:t xml:space="preserve">— a deliberate hybrid. In the US debate, each faction grabs the one piece that resembles its preferred model and ignores the rest. The conservative sees the out-of-pocket gear; the progressive sees the Beveridge gear. Singapore only works because it bolts them together.</w:t>
       </w:r>
     </w:p>
     <w:bookmarkEnd w:id="11"/>
@@ -1743,7 +1743,7 @@
         <w:t xml:space="preserve">paternalistic</w:t>
       </w:r>
       <w:r>
-        <w:t xml:space="preserve">. It tells citizens how much to save, steers them toward basic wards, and ran national tracking systems during COVID that most Americans would reject outright. The savings accounts only restrain spending because a strong state stands behind them, shaping what things cost in the first place. Take away the state, and you have left the engine on the dock. A patient shopping carefully in a market with American prices still faces American bills.</w:t>
+        <w:t xml:space="preserve">. It tells citizens how much to save, steers them toward basic wards, and ran national tracking systems during COVID that most Americans would reject outright. The savings accounts only restrain spending because a strong state stands behind them, shaping what things cost in the first place. Remove the state, and the savings accounts restrain nothing: a patient shopping carefully at American prices still gets American bills.</w:t>
       </w:r>
     </w:p>
     <w:bookmarkEnd w:id="12"/>
@@ -1979,7 +1979,7 @@
         <w:pStyle w:val="FirstParagraph"/>
       </w:pPr>
       <w:r>
-        <w:t xml:space="preserve">This does not erase Singapore’s achievement. It reframes it. The question becomes whether the efficiency Americans admire is</w:t>
+        <w:t xml:space="preserve">Singapore’s achievement is real; the exclusion changes what it shows. The efficiency Americans admire may not be</w:t>
       </w:r>
       <w:r>
         <w:t xml:space="preserve"> </w:t>
@@ -1995,7 +1995,7 @@
         <w:t xml:space="preserve"> </w:t>
       </w:r>
       <w:r>
-        <w:t xml:space="preserve">from the exclusion that helped produce it — or whether tidy numbers and a hidden second track tend to come together.</w:t>
+        <w:t xml:space="preserve">from it — tidy national numbers and a hidden second track may simply come together.</w:t>
       </w:r>
     </w:p>
     <w:p>
@@ -2003,7 +2003,7 @@
         <w:pStyle w:val="BodyText"/>
       </w:pPr>
       <w:r>
-        <w:t xml:space="preserve">And before Americans feel superior, the mirror turns. The US has its own excluded groups: undocumented immigrants who get only emergency care, and the millions who fall into the coverage gap between Medicaid and the exchanges. Every health system draws a line around who fully counts. Singapore’s line is just unusually visible — drawn between citizens and the workers who build the city. The case asks the US to notice that it draws lines too, and to ask whether its own are any easier to defend.</w:t>
+        <w:t xml:space="preserve">The US is in no position to feel superior. It has its own excluded groups: undocumented immigrants who get only emergency care, and the millions who fall into the coverage gap between Medicaid and the exchanges. Every health system draws a line around who fully counts. Singapore’s line is just unusually visible — drawn between citizens and the workers who build the city. The US draws lines too, and its own are not obviously easier to defend.</w:t>
       </w:r>
     </w:p>
     <w:bookmarkEnd w:id="13"/>

</xml_diff>